<commit_message>
docs+test: manual con el capitulo 18, pruebas del pegamento de heridas y colores del corte
El corte de mallas perdia el color de los vertices en atributos enteros
normalizados y un separador de mano agarraba siempre el mismo labio con la
herida cerrada: dos fallos que destapo la prueba nueva.

Co-Authored-By: Claude Sonnet 5.5 <noreply@anthropic.com>
</commit_message>
<xml_diff>
--- a/docs/MANUAL-DEL-TALLER-ANATOMICO.docx
+++ b/docs/MANUAL-DEL-TALLER-ANATOMICO.docx
@@ -1024,6 +1024,54 @@
                 <w:szCs w:val="17"/>
               </w:rPr>
               <w:t xml:space="preserve">La pestaña «Instrumental», el editor de casos sobre la consola y los rayos X con ayudas.</w:t>
+            </w:r>
+          </w:p>
+        </w:tc>
+      </w:tr>
+      <w:tr>
+        <w:trPr>
+          <w:cantSplit/>
+        </w:trPr>
+        <w:tc>
+          <w:tcPr>
+            <w:tcW w:type="dxa" w:w="9360"/>
+            <w:tcBorders>
+              <w:top w:val="none" w:color="FFFFFF" w:sz="0"/>
+              <w:left w:val="none" w:color="FFFFFF" w:sz="0"/>
+              <w:bottom w:val="single" w:color="C9D3E3" w:sz="2"/>
+              <w:right w:val="none" w:color="FFFFFF" w:sz="0"/>
+            </w:tcBorders>
+            <w:tcMar>
+              <w:top w:type="dxa" w:w="28"/>
+              <w:left w:type="dxa" w:w="60"/>
+              <w:bottom w:type="dxa" w:w="28"/>
+              <w:right w:type="dxa" w:w="60"/>
+            </w:tcMar>
+          </w:tcPr>
+          <w:p>
+            <w:pPr>
+              <w:spacing w:after="20"/>
+            </w:pPr>
+            <w:hyperlink w:history="1" w:anchor="cap18">
+              <w:r>
+                <w:rPr>
+                  <w:rStyle w:val="Hyperlink"/>
+                </w:rPr>
+                <w:t xml:space="preserve">18. Los instrumentos actúan: cortar, separar y perforar</w:t>
+              </w:r>
+            </w:hyperlink>
+          </w:p>
+          <w:p>
+            <w:pPr>
+              <w:spacing w:after="0"/>
+            </w:pPr>
+            <w:r>
+              <w:rPr>
+                <w:color w:val="5B6577"/>
+                <w:sz w:val="17"/>
+                <w:szCs w:val="17"/>
+              </w:rPr>
+              <w:t xml:space="preserve">La bandeja por familias, la herida que se abre, la broca con su ángulo, los implantes y los huesos pequeños.</w:t>
             </w:r>
           </w:p>
         </w:tc>
@@ -24646,11 +24694,1190 @@
         <w:pStyle w:val="Heading1"/>
         <w:pageBreakBefore/>
       </w:pPr>
-      <w:bookmarkStart w:name="anexo" w:id="18"/>
+      <w:bookmarkStart w:name="cap18" w:id="18"/>
+      <w:r>
+        <w:t xml:space="preserve">18. Los instrumentos actúan: cortar, separar y perforar</w:t>
+      </w:r>
+      <w:bookmarkEnd w:id="18"/>
+    </w:p>
+    <w:p>
+      <w:pPr>
+        <w:spacing w:after="120" w:line="288"/>
+      </w:pPr>
+      <w:r>
+        <w:t xml:space="preserve">Hasta aquí el instrumento era una pieza que se elige y se mira. Desde ahora </w:t>
+      </w:r>
+      <w:r>
+        <w:rPr>
+          <w:b/>
+          <w:bCs/>
+        </w:rPr>
+        <w:t xml:space="preserve">actúa sobre el modelo</w:t>
+      </w:r>
+      <w:r>
+        <w:t xml:space="preserve">: el bisturí parte la piel y el músculo, el separador los abre y la broca gira y deja un túnel en el hueso. Es la parte del simulador que más se parece a operar, y es práctica libre: todavía no puntúa.</w:t>
+      </w:r>
+    </w:p>
+    <w:p>
+      <w:pPr>
+        <w:pStyle w:val="Heading2"/>
+      </w:pPr>
+      <w:r>
+        <w:t xml:space="preserve">La bandeja se recorre por familias</w:t>
+      </w:r>
+    </w:p>
+    <w:p>
+      <w:pPr>
+        <w:spacing w:after="120" w:line="288"/>
+      </w:pPr>
+      <w:r>
+        <w:t xml:space="preserve">En vez de una lista de cuadros iguales, la bandeja agrupa los instrumentos como la mesa del instrumentador: </w:t>
+      </w:r>
+      <w:r>
+        <w:rPr>
+          <w:b/>
+          <w:bCs/>
+        </w:rPr>
+        <w:t xml:space="preserve">Corte y disección</w:t>
+      </w:r>
+      <w:r>
+        <w:t xml:space="preserve">, </w:t>
+      </w:r>
+      <w:r>
+        <w:rPr>
+          <w:b/>
+          <w:bCs/>
+        </w:rPr>
+        <w:t xml:space="preserve">Suturas y cierre</w:t>
+      </w:r>
+      <w:r>
+        <w:t xml:space="preserve">, </w:t>
+      </w:r>
+      <w:r>
+        <w:rPr>
+          <w:b/>
+          <w:bCs/>
+        </w:rPr>
+        <w:t xml:space="preserve">Separadores y exposición</w:t>
+      </w:r>
+      <w:r>
+        <w:t xml:space="preserve">, </w:t>
+      </w:r>
+      <w:r>
+        <w:rPr>
+          <w:b/>
+          <w:bCs/>
+        </w:rPr>
+        <w:t xml:space="preserve">Periostótomos</w:t>
+      </w:r>
+      <w:r>
+        <w:t xml:space="preserve">, </w:t>
+      </w:r>
+      <w:r>
+        <w:rPr>
+          <w:b/>
+          <w:bCs/>
+        </w:rPr>
+        <w:t xml:space="preserve">Pinzas de reducción</w:t>
+      </w:r>
+      <w:r>
+        <w:t xml:space="preserve">, </w:t>
+      </w:r>
+      <w:r>
+        <w:rPr>
+          <w:b/>
+          <w:bCs/>
+        </w:rPr>
+        <w:t xml:space="preserve">Perforación y fijación</w:t>
+      </w:r>
+      <w:r>
+        <w:t xml:space="preserve">, </w:t>
+      </w:r>
+      <w:r>
+        <w:rPr>
+          <w:b/>
+          <w:bCs/>
+        </w:rPr>
+        <w:t xml:space="preserve">Modelado de placas</w:t>
+      </w:r>
+      <w:r>
+        <w:t xml:space="preserve">, </w:t>
+      </w:r>
+      <w:r>
+        <w:rPr>
+          <w:b/>
+          <w:bCs/>
+        </w:rPr>
+        <w:t xml:space="preserve">Enclavado</w:t>
+      </w:r>
+      <w:r>
+        <w:t xml:space="preserve"> y, nuevas, </w:t>
+      </w:r>
+      <w:r>
+        <w:rPr>
+          <w:b/>
+          <w:bCs/>
+        </w:rPr>
+        <w:t xml:space="preserve">Placas</w:t>
+      </w:r>
+      <w:r>
+        <w:t xml:space="preserve">, </w:t>
+      </w:r>
+      <w:r>
+        <w:rPr>
+          <w:b/>
+          <w:bCs/>
+        </w:rPr>
+        <w:t xml:space="preserve">Tornillos</w:t>
+      </w:r>
+      <w:r>
+        <w:t xml:space="preserve">, </w:t>
+      </w:r>
+      <w:r>
+        <w:rPr>
+          <w:b/>
+          <w:bCs/>
+        </w:rPr>
+        <w:t xml:space="preserve">Clavos endomedulares</w:t>
+      </w:r>
+      <w:r>
+        <w:t xml:space="preserve"> e </w:t>
+      </w:r>
+      <w:r>
+        <w:rPr>
+          <w:b/>
+          <w:bCs/>
+        </w:rPr>
+        <w:t xml:space="preserve">Injerto óseo</w:t>
+      </w:r>
+      <w:r>
+        <w:t xml:space="preserve">. Cada familia es un botón con su contador: al pulsarlo se despliegan sus cuadros, de una familia a la vez. La que lleva el instrumento que se tiene en la mano lo dice con «en la mano». Es igual para el residente y para quien edita el caso.</w:t>
+      </w:r>
+    </w:p>
+    <w:p>
+      <w:pPr>
+        <w:keepNext/>
+        <w:spacing w:after="60" w:before="120"/>
+        <w:jc w:val="center"/>
+      </w:pPr>
+      <w:r>
+        <w:drawing>
+          <wp:inline distT="0" distB="0" distL="0" distR="0">
+            <wp:extent cx="2895600" cy="3028950"/>
+            <wp:effectExtent t="0" r="0" b="0" l="0"/>
+            <wp:docPr id="27" name="110-bandeja-por-familias" descr="La bandeja por familias: «Corte y disección» desplegada con sus tres instrumentos y las demás cerradas con su contador." title="La bandeja por familias: «Corte y disección» desplegada con sus tres instrumentos y las demás cerradas con su contador."/>
+            <wp:cNvGraphicFramePr>
+              <a:graphicFrameLocks xmlns:a="http://schemas.openxmlformats.org/drawingml/2006/main" noChangeAspect="1"/>
+            </wp:cNvGraphicFramePr>
+            <a:graphic xmlns:a="http://schemas.openxmlformats.org/drawingml/2006/main">
+              <a:graphicData uri="http://schemas.openxmlformats.org/drawingml/2006/picture">
+                <pic:pic xmlns:pic="http://schemas.openxmlformats.org/drawingml/2006/picture">
+                  <pic:nvPicPr>
+                    <pic:cNvPr id="0" name="" descr=""/>
+                    <pic:cNvPicPr>
+                      <a:picLocks noChangeAspect="1" noChangeArrowheads="1"/>
+                    </pic:cNvPicPr>
+                  </pic:nvPicPr>
+                  <pic:blipFill>
+                    <a:blip r:embed="rId37" cstate="none"/>
+                    <a:srcRect/>
+                    <a:stretch>
+                      <a:fillRect/>
+                    </a:stretch>
+                  </pic:blipFill>
+                  <pic:spPr bwMode="auto">
+                    <a:xfrm>
+                      <a:off x="0" y="0"/>
+                      <a:ext cx="2895600" cy="3028950"/>
+                    </a:xfrm>
+                    <a:prstGeom prst="rect">
+                      <a:avLst/>
+                    </a:prstGeom>
+                  </pic:spPr>
+                </pic:pic>
+              </a:graphicData>
+            </a:graphic>
+          </wp:inline>
+        </w:drawing>
+      </w:r>
+    </w:p>
+    <w:p>
+      <w:pPr>
+        <w:spacing w:after="200"/>
+        <w:jc w:val="center"/>
+      </w:pPr>
+      <w:r>
+        <w:rPr>
+          <w:b/>
+          <w:bCs/>
+          <w:color w:val="5B6577"/>
+          <w:sz w:val="19"/>
+          <w:szCs w:val="19"/>
+        </w:rPr>
+        <w:t xml:space="preserve">Figura 27. </w:t>
+      </w:r>
+      <w:r>
+        <w:rPr>
+          <w:i/>
+          <w:iCs/>
+          <w:color w:val="5B6577"/>
+          <w:sz w:val="19"/>
+          <w:szCs w:val="19"/>
+        </w:rPr>
+        <w:t xml:space="preserve">La bandeja por familias: «Corte y disección» desplegada con sus tres instrumentos y las demás cerradas con su contador.</w:t>
+      </w:r>
+    </w:p>
+    <w:p>
+      <w:pPr>
+        <w:pStyle w:val="Heading2"/>
+      </w:pPr>
+      <w:r>
+        <w:t xml:space="preserve">Cortar: el bisturí parte la malla</w:t>
+      </w:r>
+    </w:p>
+    <w:p>
+      <w:pPr>
+        <w:pStyle w:val="ListParagraph"/>
+        <w:numPr>
+          <w:ilvl w:val="0"/>
+          <w:numId w:val="20"/>
+        </w:numPr>
+        <w:spacing w:after="90" w:line="280"/>
+      </w:pPr>
+      <w:r>
+        <w:t xml:space="preserve">Encienda las capas </w:t>
+      </w:r>
+      <w:r>
+        <w:rPr>
+          <w:b/>
+          <w:bCs/>
+        </w:rPr>
+        <w:t xml:space="preserve">Piel</w:t>
+      </w:r>
+      <w:r>
+        <w:t xml:space="preserve"> y </w:t>
+      </w:r>
+      <w:r>
+        <w:rPr>
+          <w:b/>
+          <w:bCs/>
+        </w:rPr>
+        <w:t xml:space="preserve">Músculo</w:t>
+      </w:r>
+      <w:r>
+        <w:t xml:space="preserve"> (a la izquierda). Sin la capa encendida no hay nada que cortar, y la consola lo dice.</w:t>
+      </w:r>
+    </w:p>
+    <w:p>
+      <w:pPr>
+        <w:pStyle w:val="ListParagraph"/>
+        <w:numPr>
+          <w:ilvl w:val="0"/>
+          <w:numId w:val="20"/>
+        </w:numPr>
+        <w:spacing w:after="90" w:line="280"/>
+      </w:pPr>
+      <w:r>
+        <w:t xml:space="preserve">Abra </w:t>
+      </w:r>
+      <w:r>
+        <w:rPr>
+          <w:b/>
+          <w:bCs/>
+        </w:rPr>
+        <w:t xml:space="preserve">Corte y disección</w:t>
+      </w:r>
+      <w:r>
+        <w:t xml:space="preserve"> y coja el </w:t>
+      </w:r>
+      <w:r>
+        <w:rPr>
+          <w:b/>
+          <w:bCs/>
+        </w:rPr>
+        <w:t xml:space="preserve">bisturí de piel</w:t>
+      </w:r>
+      <w:r>
+        <w:t xml:space="preserve">. Pase al modo </w:t>
+      </w:r>
+      <w:r>
+        <w:rPr>
+          <w:b/>
+          <w:bCs/>
+        </w:rPr>
+        <w:t xml:space="preserve">Trazar</w:t>
+      </w:r>
+      <w:r>
+        <w:t xml:space="preserve">.</w:t>
+      </w:r>
+    </w:p>
+    <w:p>
+      <w:pPr>
+        <w:pStyle w:val="ListParagraph"/>
+        <w:numPr>
+          <w:ilvl w:val="0"/>
+          <w:numId w:val="20"/>
+        </w:numPr>
+        <w:spacing w:after="90" w:line="280"/>
+      </w:pPr>
+      <w:r>
+        <w:t xml:space="preserve">Arrastre sobre el modelo, a lo largo de donde quiera la incisión. El bisturí se inclina y se hunde mientras traza.</w:t>
+      </w:r>
+    </w:p>
+    <w:p>
+      <w:pPr>
+        <w:pStyle w:val="ListParagraph"/>
+        <w:numPr>
+          <w:ilvl w:val="0"/>
+          <w:numId w:val="20"/>
+        </w:numPr>
+        <w:spacing w:after="90" w:line="280"/>
+      </w:pPr>
+      <w:r>
+        <w:rPr>
+          <w:b/>
+          <w:bCs/>
+        </w:rPr>
+        <w:t xml:space="preserve">Suelte.</w:t>
+      </w:r>
+      <w:r>
+        <w:t xml:space="preserve"> La malla de la piel se parte por el trazo: aparece una incisión con su borde rojo y, abajo, la «Herida» con su largo.</w:t>
+      </w:r>
+    </w:p>
+    <w:p>
+      <w:pPr>
+        <w:pStyle w:val="ListParagraph"/>
+        <w:numPr>
+          <w:ilvl w:val="0"/>
+          <w:numId w:val="20"/>
+        </w:numPr>
+        <w:spacing w:after="90" w:line="280"/>
+      </w:pPr>
+      <w:r>
+        <w:t xml:space="preserve">Para llegar más hondo, coja el </w:t>
+      </w:r>
+      <w:r>
+        <w:rPr>
+          <w:b/>
+          <w:bCs/>
+        </w:rPr>
+        <w:t xml:space="preserve">bisturí profundo</w:t>
+      </w:r>
+      <w:r>
+        <w:t xml:space="preserve"> (o el electrobisturí, o las tijeras) y trace de nuevo: corta los planos de debajo —todos los músculos visibles— y deja la piel como estaba.</w:t>
+      </w:r>
+    </w:p>
+    <w:tbl>
+      <w:tblPr>
+        <w:tblW w:type="dxa" w:w="9360"/>
+        <w:tblBorders>
+          <w:top w:val="single" w:color="auto" w:sz="4"/>
+          <w:left w:val="single" w:color="auto" w:sz="4"/>
+          <w:bottom w:val="single" w:color="auto" w:sz="4"/>
+          <w:right w:val="single" w:color="auto" w:sz="4"/>
+          <w:insideH w:val="single" w:color="auto" w:sz="4"/>
+          <w:insideV w:val="single" w:color="auto" w:sz="4"/>
+        </w:tblBorders>
+      </w:tblPr>
+      <w:tblGrid>
+        <w:gridCol w:w="9360"/>
+      </w:tblGrid>
+      <w:tr>
+        <w:trPr>
+          <w:cantSplit/>
+        </w:trPr>
+        <w:tc>
+          <w:tcPr>
+            <w:tcW w:type="dxa" w:w="9360"/>
+            <w:tcBorders>
+              <w:top w:val="single" w:color="FEF3E2" w:sz="1"/>
+              <w:left w:val="single" w:color="B45309" w:sz="24"/>
+              <w:bottom w:val="single" w:color="FEF3E2" w:sz="1"/>
+              <w:right w:val="single" w:color="FEF3E2" w:sz="1"/>
+            </w:tcBorders>
+            <w:shd w:fill="FEF3E2" w:color="auto" w:val="clear"/>
+            <w:tcMar>
+              <w:top w:type="dxa" w:w="100"/>
+              <w:left w:type="dxa" w:w="180"/>
+              <w:bottom w:type="dxa" w:w="80"/>
+              <w:right w:type="dxa" w:w="180"/>
+            </w:tcMar>
+          </w:tcPr>
+          <w:p>
+            <w:pPr>
+              <w:spacing w:after="60"/>
+            </w:pPr>
+            <w:r>
+              <w:rPr>
+                <w:b/>
+                <w:bCs/>
+                <w:color w:val="B45309"/>
+              </w:rPr>
+              <w:t xml:space="preserve">Qué se deshace y qué no</w:t>
+            </w:r>
+          </w:p>
+          <w:p>
+            <w:pPr>
+              <w:spacing w:after="60" w:line="276"/>
+            </w:pPr>
+            <w:r>
+              <w:t xml:space="preserve">«Borrar trazo» deshace el corte que ese trazo hizo. Pasar al paso siguiente </w:t>
+            </w:r>
+            <w:r>
+              <w:rPr>
+                <w:b/>
+                <w:bCs/>
+              </w:rPr>
+              <w:t xml:space="preserve">no</w:t>
+            </w:r>
+            <w:r>
+              <w:t xml:space="preserve">: la piel cortada sigue cortada. «Cerrar la herida», en el panel de la izquierda, o reiniciar el caso, devuelven el modelo entero.</w:t>
+            </w:r>
+          </w:p>
+        </w:tc>
+      </w:tr>
+    </w:tbl>
+    <w:p>
+      <w:pPr>
+        <w:pStyle w:val="Heading2"/>
+      </w:pPr>
+      <w:r>
+        <w:t xml:space="preserve">Separar: abrir la herida</w:t>
+      </w:r>
+    </w:p>
+    <w:p>
+      <w:pPr>
+        <w:spacing w:after="120" w:line="288"/>
+      </w:pPr>
+      <w:r>
+        <w:t xml:space="preserve">Al coger un separador el modo pasa solo a </w:t>
+      </w:r>
+      <w:r>
+        <w:rPr>
+          <w:b/>
+          <w:bCs/>
+        </w:rPr>
+        <w:t xml:space="preserve">Separar</w:t>
+      </w:r>
+      <w:r>
+        <w:t xml:space="preserve">. Se arrastra desde el borde de la herida hacia fuera:</w:t>
+      </w:r>
+    </w:p>
+    <w:p>
+      <w:pPr>
+        <w:pStyle w:val="ListParagraph"/>
+        <w:numPr>
+          <w:ilvl w:val="0"/>
+          <w:numId w:val="3"/>
+        </w:numPr>
+        <w:spacing w:after="70" w:line="276"/>
+      </w:pPr>
+      <w:r>
+        <w:rPr>
+          <w:b/>
+          <w:bCs/>
+        </w:rPr>
+        <w:t xml:space="preserve">De mano</w:t>
+      </w:r>
+      <w:r>
+        <w:t xml:space="preserve"> (Senn-Miller, Farabeuf, Hohmann): abre solo el borde que se agarra, hasta 22–40 mm. El otro lo sostiene un ayudante, que es lo que hace un Farabeuf: se usan en pareja.</w:t>
+      </w:r>
+    </w:p>
+    <w:p>
+      <w:pPr>
+        <w:pStyle w:val="ListParagraph"/>
+        <w:numPr>
+          <w:ilvl w:val="0"/>
+          <w:numId w:val="3"/>
+        </w:numPr>
+        <w:spacing w:after="70" w:line="276"/>
+      </w:pPr>
+      <w:r>
+        <w:rPr>
+          <w:b/>
+          <w:bCs/>
+        </w:rPr>
+        <w:t xml:space="preserve">Autoestáticos</w:t>
+      </w:r>
+      <w:r>
+        <w:t xml:space="preserve"> (Gelpi, Weitlaner, Beckman-Adson): abren los dos bordes a la vez y se quedan abiertos con su trinquete, hasta 55–90 mm.</w:t>
+      </w:r>
+    </w:p>
+    <w:p>
+      <w:pPr>
+        <w:spacing w:after="120" w:line="288"/>
+      </w:pPr>
+      <w:r>
+        <w:t xml:space="preserve">También hay un deslizador </w:t>
+      </w:r>
+      <w:r>
+        <w:rPr>
+          <w:b/>
+          <w:bCs/>
+        </w:rPr>
+        <w:t xml:space="preserve">Apertura</w:t>
+      </w:r>
+      <w:r>
+        <w:t xml:space="preserve"> en el recuadro del instrumento, para abrir sin arrastrar. La herida se abre en forma de lente —cerrada en las puntas— y deja ver el plano de abajo: el músculo y, si se cortó, el hueso.</w:t>
+      </w:r>
+    </w:p>
+    <w:p>
+      <w:pPr>
+        <w:keepNext/>
+        <w:spacing w:after="60" w:before="120"/>
+        <w:jc w:val="center"/>
+      </w:pPr>
+      <w:r>
+        <w:drawing>
+          <wp:inline distT="0" distB="0" distL="0" distR="0">
+            <wp:extent cx="4905375" cy="5057775"/>
+            <wp:effectExtent t="0" r="0" b="0" l="0"/>
+            <wp:docPr id="28" name="112-herida-abierta" descr="Una incisión de la piel y de los planos profundos abierta 36 mm con un separador de Weitlaner: se ve el músculo rojo y el hueso al fondo." title="Una incisión de la piel y de los planos profundos abierta 36 mm con un separador de Weitlaner: se ve el músculo rojo y el hueso al fondo."/>
+            <wp:cNvGraphicFramePr>
+              <a:graphicFrameLocks xmlns:a="http://schemas.openxmlformats.org/drawingml/2006/main" noChangeAspect="1"/>
+            </wp:cNvGraphicFramePr>
+            <a:graphic xmlns:a="http://schemas.openxmlformats.org/drawingml/2006/main">
+              <a:graphicData uri="http://schemas.openxmlformats.org/drawingml/2006/picture">
+                <pic:pic xmlns:pic="http://schemas.openxmlformats.org/drawingml/2006/picture">
+                  <pic:nvPicPr>
+                    <pic:cNvPr id="0" name="" descr=""/>
+                    <pic:cNvPicPr>
+                      <a:picLocks noChangeAspect="1" noChangeArrowheads="1"/>
+                    </pic:cNvPicPr>
+                  </pic:nvPicPr>
+                  <pic:blipFill>
+                    <a:blip r:embed="rId38" cstate="none"/>
+                    <a:srcRect/>
+                    <a:stretch>
+                      <a:fillRect/>
+                    </a:stretch>
+                  </pic:blipFill>
+                  <pic:spPr bwMode="auto">
+                    <a:xfrm>
+                      <a:off x="0" y="0"/>
+                      <a:ext cx="4905375" cy="5057775"/>
+                    </a:xfrm>
+                    <a:prstGeom prst="rect">
+                      <a:avLst/>
+                    </a:prstGeom>
+                  </pic:spPr>
+                </pic:pic>
+              </a:graphicData>
+            </a:graphic>
+          </wp:inline>
+        </w:drawing>
+      </w:r>
+    </w:p>
+    <w:p>
+      <w:pPr>
+        <w:spacing w:after="200"/>
+        <w:jc w:val="center"/>
+      </w:pPr>
+      <w:r>
+        <w:rPr>
+          <w:b/>
+          <w:bCs/>
+          <w:color w:val="5B6577"/>
+          <w:sz w:val="19"/>
+          <w:szCs w:val="19"/>
+        </w:rPr>
+        <w:t xml:space="preserve">Figura 28. </w:t>
+      </w:r>
+      <w:r>
+        <w:rPr>
+          <w:i/>
+          <w:iCs/>
+          <w:color w:val="5B6577"/>
+          <w:sz w:val="19"/>
+          <w:szCs w:val="19"/>
+        </w:rPr>
+        <w:t xml:space="preserve">Una incisión de la piel y de los planos profundos abierta 36 mm con un separador de Weitlaner: se ve el músculo rojo y el hueso al fondo.</w:t>
+      </w:r>
+    </w:p>
+    <w:p>
+      <w:pPr>
+        <w:pStyle w:val="Heading2"/>
+      </w:pPr>
+      <w:r>
+        <w:t xml:space="preserve">Perforar: la broca gira y avanza</w:t>
+      </w:r>
+    </w:p>
+    <w:p>
+      <w:pPr>
+        <w:pStyle w:val="ListParagraph"/>
+        <w:numPr>
+          <w:ilvl w:val="0"/>
+          <w:numId w:val="21"/>
+        </w:numPr>
+        <w:spacing w:after="90" w:line="280"/>
+      </w:pPr>
+      <w:r>
+        <w:t xml:space="preserve">Abra </w:t>
+      </w:r>
+      <w:r>
+        <w:rPr>
+          <w:b/>
+          <w:bCs/>
+        </w:rPr>
+        <w:t xml:space="preserve">Perforación y fijación</w:t>
+      </w:r>
+      <w:r>
+        <w:t xml:space="preserve"> y coja una </w:t>
+      </w:r>
+      <w:r>
+        <w:rPr>
+          <w:b/>
+          <w:bCs/>
+        </w:rPr>
+        <w:t xml:space="preserve">broca</w:t>
+      </w:r>
+      <w:r>
+        <w:t xml:space="preserve">. El modo pasa solo a </w:t>
+      </w:r>
+      <w:r>
+        <w:rPr>
+          <w:b/>
+          <w:bCs/>
+        </w:rPr>
+        <w:t xml:space="preserve">Perforar</w:t>
+      </w:r>
+      <w:r>
+        <w:t xml:space="preserve">.</w:t>
+      </w:r>
+    </w:p>
+    <w:p>
+      <w:pPr>
+        <w:pStyle w:val="ListParagraph"/>
+        <w:numPr>
+          <w:ilvl w:val="0"/>
+          <w:numId w:val="21"/>
+        </w:numPr>
+        <w:spacing w:after="90" w:line="280"/>
+      </w:pPr>
+      <w:r>
+        <w:t xml:space="preserve">Elija la </w:t>
+      </w:r>
+      <w:r>
+        <w:rPr>
+          <w:b/>
+          <w:bCs/>
+        </w:rPr>
+        <w:t xml:space="preserve">inclinación</w:t>
+      </w:r>
+      <w:r>
+        <w:t xml:space="preserve"> con los dos deslizadores del recuadro: *a lo largo del hueso* y *a lo ancho*, de −45° a +45° sobre la cortical. «Perpendicular a la cortical» los deja en cero.</w:t>
+      </w:r>
+    </w:p>
+    <w:p>
+      <w:pPr>
+        <w:pStyle w:val="ListParagraph"/>
+        <w:numPr>
+          <w:ilvl w:val="0"/>
+          <w:numId w:val="21"/>
+        </w:numPr>
+        <w:spacing w:after="90" w:line="280"/>
+      </w:pPr>
+      <w:r>
+        <w:t xml:space="preserve">Apunte al hueso. Una etiqueta sobre el lienzo dice el </w:t>
+      </w:r>
+      <w:r>
+        <w:rPr>
+          <w:b/>
+          <w:bCs/>
+        </w:rPr>
+        <w:t xml:space="preserve">ángulo con el eje del hueso</w:t>
+      </w:r>
+      <w:r>
+        <w:t xml:space="preserve"> (90° es perpendicular).</w:t>
+      </w:r>
+    </w:p>
+    <w:p>
+      <w:pPr>
+        <w:pStyle w:val="ListParagraph"/>
+        <w:numPr>
+          <w:ilvl w:val="0"/>
+          <w:numId w:val="21"/>
+        </w:numPr>
+        <w:spacing w:after="90" w:line="280"/>
+      </w:pPr>
+      <w:r>
+        <w:rPr>
+          <w:b/>
+          <w:bCs/>
+        </w:rPr>
+        <w:t xml:space="preserve">Mantenga pulsado</w:t>
+      </w:r>
+      <w:r>
+        <w:t xml:space="preserve">: la broca gira y avanza unos 9 mm por segundo. La etiqueta cuenta la profundidad.</w:t>
+      </w:r>
+    </w:p>
+    <w:p>
+      <w:pPr>
+        <w:pStyle w:val="ListParagraph"/>
+        <w:numPr>
+          <w:ilvl w:val="0"/>
+          <w:numId w:val="21"/>
+        </w:numPr>
+        <w:spacing w:after="90" w:line="280"/>
+      </w:pPr>
+      <w:r>
+        <w:t xml:space="preserve">Suelte. Queda el túnel, y el registro anota el calibre, la profundidad, si fue </w:t>
+      </w:r>
+      <w:r>
+        <w:rPr>
+          <w:b/>
+          <w:bCs/>
+        </w:rPr>
+        <w:t xml:space="preserve">bicortical</w:t>
+      </w:r>
+      <w:r>
+        <w:t xml:space="preserve"> y el ángulo.</w:t>
+      </w:r>
+    </w:p>
+    <w:p>
+      <w:pPr>
+        <w:keepNext/>
+        <w:spacing w:after="60" w:before="120"/>
+        <w:jc w:val="center"/>
+      </w:pPr>
+      <w:r>
+        <w:drawing>
+          <wp:inline distT="0" distB="0" distL="0" distR="0">
+            <wp:extent cx="4905375" cy="5057775"/>
+            <wp:effectExtent t="0" r="0" b="0" l="0"/>
+            <wp:docPr id="29" name="113-broca-con-angulo" descr="Una broca de 2,5 mm con 25° de inclinación a lo largo del hueso: la etiqueta dice «65° con el eje del hueso» y la profundidad que lleva." title="Una broca de 2,5 mm con 25° de inclinación a lo largo del hueso: la etiqueta dice «65° con el eje del hueso» y la profundidad que lleva."/>
+            <wp:cNvGraphicFramePr>
+              <a:graphicFrameLocks xmlns:a="http://schemas.openxmlformats.org/drawingml/2006/main" noChangeAspect="1"/>
+            </wp:cNvGraphicFramePr>
+            <a:graphic xmlns:a="http://schemas.openxmlformats.org/drawingml/2006/main">
+              <a:graphicData uri="http://schemas.openxmlformats.org/drawingml/2006/picture">
+                <pic:pic xmlns:pic="http://schemas.openxmlformats.org/drawingml/2006/picture">
+                  <pic:nvPicPr>
+                    <pic:cNvPr id="0" name="" descr=""/>
+                    <pic:cNvPicPr>
+                      <a:picLocks noChangeAspect="1" noChangeArrowheads="1"/>
+                    </pic:cNvPicPr>
+                  </pic:nvPicPr>
+                  <pic:blipFill>
+                    <a:blip r:embed="rId39" cstate="none"/>
+                    <a:srcRect/>
+                    <a:stretch>
+                      <a:fillRect/>
+                    </a:stretch>
+                  </pic:blipFill>
+                  <pic:spPr bwMode="auto">
+                    <a:xfrm>
+                      <a:off x="0" y="0"/>
+                      <a:ext cx="4905375" cy="5057775"/>
+                    </a:xfrm>
+                    <a:prstGeom prst="rect">
+                      <a:avLst/>
+                    </a:prstGeom>
+                  </pic:spPr>
+                </pic:pic>
+              </a:graphicData>
+            </a:graphic>
+          </wp:inline>
+        </w:drawing>
+      </w:r>
+    </w:p>
+    <w:p>
+      <w:pPr>
+        <w:spacing w:after="200"/>
+        <w:jc w:val="center"/>
+      </w:pPr>
+      <w:r>
+        <w:rPr>
+          <w:b/>
+          <w:bCs/>
+          <w:color w:val="5B6577"/>
+          <w:sz w:val="19"/>
+          <w:szCs w:val="19"/>
+        </w:rPr>
+        <w:t xml:space="preserve">Figura 29. </w:t>
+      </w:r>
+      <w:r>
+        <w:rPr>
+          <w:i/>
+          <w:iCs/>
+          <w:color w:val="5B6577"/>
+          <w:sz w:val="19"/>
+          <w:szCs w:val="19"/>
+        </w:rPr>
+        <w:t xml:space="preserve">Una broca de 2,5 mm con 25° de inclinación a lo largo del hueso: la etiqueta dice «65° con el eje del hueso» y la profundidad que lleva.</w:t>
+      </w:r>
+    </w:p>
+    <w:tbl>
+      <w:tblPr>
+        <w:tblW w:type="dxa" w:w="9360"/>
+        <w:tblBorders>
+          <w:top w:val="single" w:color="auto" w:sz="4"/>
+          <w:left w:val="single" w:color="auto" w:sz="4"/>
+          <w:bottom w:val="single" w:color="auto" w:sz="4"/>
+          <w:right w:val="single" w:color="auto" w:sz="4"/>
+          <w:insideH w:val="single" w:color="auto" w:sz="4"/>
+          <w:insideV w:val="single" w:color="auto" w:sz="4"/>
+        </w:tblBorders>
+      </w:tblPr>
+      <w:tblGrid>
+        <w:gridCol w:w="9360"/>
+      </w:tblGrid>
+      <w:tr>
+        <w:trPr>
+          <w:cantSplit/>
+        </w:trPr>
+        <w:tc>
+          <w:tcPr>
+            <w:tcW w:type="dxa" w:w="9360"/>
+            <w:tcBorders>
+              <w:top w:val="single" w:color="FEF3E2" w:sz="1"/>
+              <w:left w:val="single" w:color="B45309" w:sz="24"/>
+              <w:bottom w:val="single" w:color="FEF3E2" w:sz="1"/>
+              <w:right w:val="single" w:color="FEF3E2" w:sz="1"/>
+            </w:tcBorders>
+            <w:shd w:fill="FEF3E2" w:color="auto" w:val="clear"/>
+            <w:tcMar>
+              <w:top w:type="dxa" w:w="100"/>
+              <w:left w:type="dxa" w:w="180"/>
+              <w:bottom w:type="dxa" w:w="80"/>
+              <w:right w:type="dxa" w:w="180"/>
+            </w:tcMar>
+          </w:tcPr>
+          <w:p>
+            <w:pPr>
+              <w:spacing w:after="60"/>
+            </w:pPr>
+            <w:r>
+              <w:rPr>
+                <w:b/>
+                <w:bCs/>
+                <w:color w:val="B45309"/>
+              </w:rPr>
+              <w:t xml:space="preserve">Pasarse de largo</w:t>
+            </w:r>
+          </w:p>
+          <w:p>
+            <w:pPr>
+              <w:spacing w:after="60" w:line="276"/>
+            </w:pPr>
+            <w:r>
+              <w:t xml:space="preserve">La broca puede pasar la cortical opuesta —es el error clásico de quien aprende—. Si pasa de unos milímetros, la etiqueta lo dice mientras ocurre y el registro lo anota como riesgo para las partes blandas.</w:t>
+            </w:r>
+          </w:p>
+        </w:tc>
+      </w:tr>
+    </w:tbl>
+    <w:p>
+      <w:pPr>
+        <w:pStyle w:val="Heading2"/>
+      </w:pPr>
+      <w:r>
+        <w:t xml:space="preserve">Implantes en la bandeja</w:t>
+      </w:r>
+    </w:p>
+    <w:p>
+      <w:pPr>
+        <w:spacing w:after="120" w:line="288"/>
+      </w:pPr>
+      <w:r>
+        <w:t xml:space="preserve">El catálogo suma 23 modelos nuevos, hechos con Blender como el resto: </w:t>
+      </w:r>
+      <w:r>
+        <w:rPr>
+          <w:b/>
+          <w:bCs/>
+        </w:rPr>
+        <w:t xml:space="preserve">diez placas</w:t>
+      </w:r>
+      <w:r>
+        <w:t xml:space="preserve"> (DCP 4,5, LC-DCP 3,5, LCP recta 3,5 y 4,5/5,0, LCP anatómica de tibia proximal, tercio de caña, reconstrucción, T, L y en gancho para clavícula), </w:t>
+      </w:r>
+      <w:r>
+        <w:rPr>
+          <w:b/>
+          <w:bCs/>
+        </w:rPr>
+        <w:t xml:space="preserve">cuatro tornillos</w:t>
+      </w:r>
+      <w:r>
+        <w:t xml:space="preserve"> (cortical 3,5, de esponjosa 6,5, bloqueado LCP 3,5 y de bloqueo de clavo 5,0), </w:t>
+      </w:r>
+      <w:r>
+        <w:rPr>
+          <w:b/>
+          <w:bCs/>
+        </w:rPr>
+        <w:t xml:space="preserve">tres clavos</w:t>
+      </w:r>
+      <w:r>
+        <w:t xml:space="preserve"> (tibial 9 × 330, femoral 11 × 380 y cefalomedular PFN con sus dos tornillos), </w:t>
+      </w:r>
+      <w:r>
+        <w:rPr>
+          <w:b/>
+          <w:bCs/>
+        </w:rPr>
+        <w:t xml:space="preserve">dos injertos</w:t>
+      </w:r>
+      <w:r>
+        <w:t xml:space="preserve"> (tricortical de cresta ilíaca y esponjoso en trozos) y </w:t>
+      </w:r>
+      <w:r>
+        <w:rPr>
+          <w:b/>
+          <w:bCs/>
+        </w:rPr>
+        <w:t xml:space="preserve">cuatro brocas</w:t>
+      </w:r>
+      <w:r>
+        <w:t xml:space="preserve"> (1,5, 2,0, 3,5 y 4,5 mm).</w:t>
+      </w:r>
+    </w:p>
+    <w:tbl>
+      <w:tblPr>
+        <w:tblW w:type="dxa" w:w="9360"/>
+        <w:tblBorders>
+          <w:top w:val="single" w:color="auto" w:sz="4"/>
+          <w:left w:val="single" w:color="auto" w:sz="4"/>
+          <w:bottom w:val="single" w:color="auto" w:sz="4"/>
+          <w:right w:val="single" w:color="auto" w:sz="4"/>
+          <w:insideH w:val="single" w:color="auto" w:sz="4"/>
+          <w:insideV w:val="single" w:color="auto" w:sz="4"/>
+        </w:tblBorders>
+      </w:tblPr>
+      <w:tblGrid>
+        <w:gridCol w:w="9360"/>
+      </w:tblGrid>
+      <w:tr>
+        <w:trPr>
+          <w:cantSplit/>
+        </w:trPr>
+        <w:tc>
+          <w:tcPr>
+            <w:tcW w:type="dxa" w:w="9360"/>
+            <w:tcBorders>
+              <w:top w:val="single" w:color="F3F4F6" w:sz="1"/>
+              <w:left w:val="single" w:color="5B6577" w:sz="24"/>
+              <w:bottom w:val="single" w:color="F3F4F6" w:sz="1"/>
+              <w:right w:val="single" w:color="F3F4F6" w:sz="1"/>
+            </w:tcBorders>
+            <w:shd w:fill="F3F4F6" w:color="auto" w:val="clear"/>
+            <w:tcMar>
+              <w:top w:type="dxa" w:w="100"/>
+              <w:left w:type="dxa" w:w="180"/>
+              <w:bottom w:type="dxa" w:w="80"/>
+              <w:right w:type="dxa" w:w="180"/>
+            </w:tcMar>
+          </w:tcPr>
+          <w:p>
+            <w:pPr>
+              <w:spacing w:after="60"/>
+            </w:pPr>
+            <w:r>
+              <w:rPr>
+                <w:b/>
+                <w:bCs/>
+                <w:color w:val="5B6577"/>
+              </w:rPr>
+              <w:t xml:space="preserve">Medidas y tamaños</w:t>
+            </w:r>
+          </w:p>
+          <w:p>
+            <w:pPr>
+              <w:spacing w:after="60" w:line="276"/>
+            </w:pPr>
+            <w:r>
+              <w:t xml:space="preserve">Hay un modelo por tipo, no uno por calibre, y las medidas son de referencia. Cristóbal enviará el catálogo y se corrigen. Para cargarlos en el servidor: </w:t>
+            </w:r>
+            <w:r>
+              <w:rPr>
+                <w:b/>
+                <w:bCs/>
+              </w:rPr>
+              <w:t xml:space="preserve">Completar el catálogo</w:t>
+            </w:r>
+            <w:r>
+              <w:t xml:space="preserve"> crea las fichas y </w:t>
+            </w:r>
+            <w:r>
+              <w:rPr>
+                <w:b/>
+                <w:bCs/>
+              </w:rPr>
+              <w:t xml:space="preserve">Cargar varios modelos…</w:t>
+            </w:r>
+            <w:r>
+              <w:t xml:space="preserve"> enlaza cada archivo por su nombre.</w:t>
+            </w:r>
+          </w:p>
+        </w:tc>
+      </w:tr>
+    </w:tbl>
+    <w:p>
+      <w:pPr>
+        <w:pStyle w:val="Heading2"/>
+      </w:pPr>
+      <w:r>
+        <w:t xml:space="preserve">Más huesos en el asistente de fracturas</w:t>
+      </w:r>
+    </w:p>
+    <w:p>
+      <w:pPr>
+        <w:spacing w:after="120" w:line="288"/>
+      </w:pPr>
+      <w:r>
+        <w:t xml:space="preserve">La pestaña </w:t>
+      </w:r>
+      <w:r>
+        <w:rPr>
+          <w:b/>
+          <w:bCs/>
+        </w:rPr>
+        <w:t xml:space="preserve">Fractura</w:t>
+      </w:r>
+      <w:r>
+        <w:t xml:space="preserve"> del taller anatómico ya reconoce, además de los seis huesos largos, la </w:t>
+      </w:r>
+      <w:r>
+        <w:rPr>
+          <w:b/>
+          <w:bCs/>
+        </w:rPr>
+        <w:t xml:space="preserve">clavícula</w:t>
+      </w:r>
+      <w:r>
+        <w:t xml:space="preserve">, los </w:t>
+      </w:r>
+      <w:r>
+        <w:rPr>
+          <w:b/>
+          <w:bCs/>
+        </w:rPr>
+        <w:t xml:space="preserve">metacarpianos</w:t>
+      </w:r>
+      <w:r>
+        <w:t xml:space="preserve">, los </w:t>
+      </w:r>
+      <w:r>
+        <w:rPr>
+          <w:b/>
+          <w:bCs/>
+        </w:rPr>
+        <w:t xml:space="preserve">metatarsianos</w:t>
+      </w:r>
+      <w:r>
+        <w:t xml:space="preserve"> y las </w:t>
+      </w:r>
+      <w:r>
+        <w:rPr>
+          <w:b/>
+          <w:bCs/>
+        </w:rPr>
+        <w:t xml:space="preserve">falanges</w:t>
+      </w:r>
+      <w:r>
+        <w:t xml:space="preserve"> de la mano y del pie (90 piezas, derechas e izquierdas). La </w:t>
+      </w:r>
+      <w:r>
+        <w:rPr>
+          <w:b/>
+          <w:bCs/>
+        </w:rPr>
+        <w:t xml:space="preserve">espiroidea (A1)</w:t>
+      </w:r>
+      <w:r>
+        <w:t xml:space="preserve"> se puede elegir, aproximada con un plano muy oblicuo. Tres avisos:</w:t>
+      </w:r>
+    </w:p>
+    <w:p>
+      <w:pPr>
+        <w:pStyle w:val="ListParagraph"/>
+        <w:numPr>
+          <w:ilvl w:val="0"/>
+          <w:numId w:val="3"/>
+        </w:numPr>
+        <w:spacing w:after="70" w:line="276"/>
+      </w:pPr>
+      <w:r>
+        <w:t xml:space="preserve">La clavícula lleva su código con punto («15.2-A2») y sus extremos son </w:t>
+      </w:r>
+      <w:r>
+        <w:rPr>
+          <w:b/>
+          <w:bCs/>
+        </w:rPr>
+        <w:t xml:space="preserve">medial</w:t>
+      </w:r>
+      <w:r>
+        <w:t xml:space="preserve"> y </w:t>
+      </w:r>
+      <w:r>
+        <w:rPr>
+          <w:b/>
+          <w:bCs/>
+        </w:rPr>
+        <w:t xml:space="preserve">lateral</w:t>
+      </w:r>
+      <w:r>
+        <w:t xml:space="preserve">.</w:t>
+      </w:r>
+    </w:p>
+    <w:p>
+      <w:pPr>
+        <w:pStyle w:val="ListParagraph"/>
+        <w:numPr>
+          <w:ilvl w:val="0"/>
+          <w:numId w:val="3"/>
+        </w:numPr>
+        <w:spacing w:after="70" w:line="276"/>
+      </w:pPr>
+      <w:r>
+        <w:t xml:space="preserve">Los códigos de </w:t>
+      </w:r>
+      <w:r>
+        <w:rPr>
+          <w:b/>
+          <w:bCs/>
+        </w:rPr>
+        <w:t xml:space="preserve">mano y pie</w:t>
+      </w:r>
+      <w:r>
+        <w:t xml:space="preserve"> son </w:t>
+      </w:r>
+      <w:r>
+        <w:rPr>
+          <w:b/>
+          <w:bCs/>
+        </w:rPr>
+        <w:t xml:space="preserve">provisionales</w:t>
+      </w:r>
+      <w:r>
+        <w:t xml:space="preserve">: no están validados contra el compendio de 2018.</w:t>
+      </w:r>
+    </w:p>
+    <w:p>
+      <w:pPr>
+        <w:pStyle w:val="ListParagraph"/>
+        <w:numPr>
+          <w:ilvl w:val="0"/>
+          <w:numId w:val="3"/>
+        </w:numPr>
+        <w:spacing w:after="70" w:line="276"/>
+      </w:pPr>
+      <w:r>
+        <w:t xml:space="preserve">En las falanges, que miden 30 a 40 mm, la cuña y la segmentaria fragmentada pueden salir con la malla abierta o fallar; la pestaña lo avisa con una nota bajo el hueso. La rótula, la escápula, el astrágalo y el calcáneo quedan fuera: se clasifican por la superficie articular.</w:t>
+      </w:r>
+    </w:p>
+    <w:p>
+      <w:pPr>
+        <w:pStyle w:val="Heading1"/>
+        <w:pageBreakBefore/>
+      </w:pPr>
+      <w:bookmarkStart w:name="anexo" w:id="19"/>
       <w:r>
         <w:t xml:space="preserve">Anexos</w:t>
       </w:r>
-      <w:bookmarkEnd w:id="18"/>
+      <w:bookmarkEnd w:id="19"/>
     </w:p>
     <w:p>
       <w:pPr>
@@ -26312,6 +27539,18 @@
     </w:lvlOverride>
   </w:num>
   <w:num w:numId="19">
+    <w:abstractNumId w:val="3"/>
+    <w:lvlOverride w:ilvl="0">
+      <w:startOverride w:val="1"/>
+    </w:lvlOverride>
+  </w:num>
+  <w:num w:numId="20">
+    <w:abstractNumId w:val="3"/>
+    <w:lvlOverride w:ilvl="0">
+      <w:startOverride w:val="1"/>
+    </w:lvlOverride>
+  </w:num>
+  <w:num w:numId="21">
     <w:abstractNumId w:val="3"/>
     <w:lvlOverride w:ilvl="0">
       <w:startOverride w:val="1"/>

</xml_diff>

<commit_message>
feat(P-001 E5/E6): coser, placa y tornillos sobre el hueso, broca y fijacion que puntuan, buscador por clasificacion AO
- sutura: modo Coser, hilo apoyado en la piel, cruces que cierran la herida
- modo Fijar: placa sobre el hueso, medidor de profundidad, tornillos bicorticales
- objetivos perforacion y fijacion en los pasos (migracion)
- Tecnica AO: buscador por clasificacion y campo tratamiento (migracion)
- manual, bitacora D-169

Co-Authored-By: Claude Sonnet 5.5 <noreply@anthropic.com>
</commit_message>
<xml_diff>
--- a/docs/MANUAL-DEL-TALLER-ANATOMICO.docx
+++ b/docs/MANUAL-DEL-TALLER-ANATOMICO.docx
@@ -1072,6 +1072,54 @@
                 <w:szCs w:val="17"/>
               </w:rPr>
               <w:t xml:space="preserve">La bandeja por familias, la herida que se abre, la broca con su ángulo, los implantes y los huesos pequeños.</w:t>
+            </w:r>
+          </w:p>
+        </w:tc>
+      </w:tr>
+      <w:tr>
+        <w:trPr>
+          <w:cantSplit/>
+        </w:trPr>
+        <w:tc>
+          <w:tcPr>
+            <w:tcW w:type="dxa" w:w="9360"/>
+            <w:tcBorders>
+              <w:top w:val="none" w:color="FFFFFF" w:sz="0"/>
+              <w:left w:val="none" w:color="FFFFFF" w:sz="0"/>
+              <w:bottom w:val="single" w:color="C9D3E3" w:sz="2"/>
+              <w:right w:val="none" w:color="FFFFFF" w:sz="0"/>
+            </w:tcBorders>
+            <w:tcMar>
+              <w:top w:type="dxa" w:w="28"/>
+              <w:left w:type="dxa" w:w="60"/>
+              <w:bottom w:type="dxa" w:w="28"/>
+              <w:right w:type="dxa" w:w="60"/>
+            </w:tcMar>
+          </w:tcPr>
+          <w:p>
+            <w:pPr>
+              <w:spacing w:after="20"/>
+            </w:pPr>
+            <w:hyperlink w:history="1" w:anchor="cap19">
+              <w:r>
+                <w:rPr>
+                  <w:rStyle w:val="Hyperlink"/>
+                </w:rPr>
+                <w:t xml:space="preserve">19. Coser, fijar con placa y buscar por clasificación</w:t>
+              </w:r>
+            </w:hyperlink>
+          </w:p>
+          <w:p>
+            <w:pPr>
+              <w:spacing w:after="0"/>
+            </w:pPr>
+            <w:r>
+              <w:rPr>
+                <w:color w:val="5B6577"/>
+                <w:sz w:val="17"/>
+                <w:szCs w:val="17"/>
+              </w:rPr>
+              <w:t xml:space="preserve">La sutura, la placa y los tornillos sobre el hueso, la fractura en martillo, los códigos de 2018 y el buscador de Técnica AO.</w:t>
             </w:r>
           </w:p>
         </w:tc>
@@ -25873,11 +25921,1130 @@
         <w:pStyle w:val="Heading1"/>
         <w:pageBreakBefore/>
       </w:pPr>
-      <w:bookmarkStart w:name="anexo" w:id="19"/>
+      <w:bookmarkStart w:name="cap19" w:id="19"/>
+      <w:r>
+        <w:t xml:space="preserve">19. Coser, fijar con placa y buscar por clasificación</w:t>
+      </w:r>
+      <w:bookmarkEnd w:id="19"/>
+    </w:p>
+    <w:p>
+      <w:pPr>
+        <w:spacing w:after="120" w:line="288"/>
+      </w:pPr>
+      <w:r>
+        <w:t xml:space="preserve">Este capítulo reúne lo que se añadió después del anterior: el simulador </w:t>
+      </w:r>
+      <w:r>
+        <w:rPr>
+          <w:b/>
+          <w:bCs/>
+        </w:rPr>
+        <w:t xml:space="preserve">cose</w:t>
+      </w:r>
+      <w:r>
+        <w:t xml:space="preserve"> y </w:t>
+      </w:r>
+      <w:r>
+        <w:rPr>
+          <w:b/>
+          <w:bCs/>
+        </w:rPr>
+        <w:t xml:space="preserve">atornilla una placa</w:t>
+      </w:r>
+      <w:r>
+        <w:t xml:space="preserve">, la broca y la fijación </w:t>
+      </w:r>
+      <w:r>
+        <w:rPr>
+          <w:b/>
+          <w:bCs/>
+        </w:rPr>
+        <w:t xml:space="preserve">puntúan</w:t>
+      </w:r>
+      <w:r>
+        <w:t xml:space="preserve">, el taller sabe construir la </w:t>
+      </w:r>
+      <w:r>
+        <w:rPr>
+          <w:b/>
+          <w:bCs/>
+        </w:rPr>
+        <w:t xml:space="preserve">fractura en martillo</w:t>
+      </w:r>
+      <w:r>
+        <w:t xml:space="preserve">, los códigos de la mano y del pie son los del compendio de 2018 y </w:t>
+      </w:r>
+      <w:r>
+        <w:rPr>
+          <w:b/>
+          <w:bCs/>
+        </w:rPr>
+        <w:t xml:space="preserve">Técnica AO</w:t>
+      </w:r>
+      <w:r>
+        <w:t xml:space="preserve"> se puede buscar por clasificación. Todo se probó sobre el modelo del atlas.</w:t>
+      </w:r>
+    </w:p>
+    <w:p>
+      <w:pPr>
+        <w:pStyle w:val="Heading2"/>
+      </w:pPr>
+      <w:r>
+        <w:t xml:space="preserve">Al cambiar el modelo del caso</w:t>
+      </w:r>
+    </w:p>
+    <w:p>
+      <w:pPr>
+        <w:spacing w:after="120" w:line="288"/>
+      </w:pPr>
+      <w:r>
+        <w:t xml:space="preserve">Si el caso hablaba de otro archivo —se eligió otro modelo del atlas—, el editor ya no deja el aviso «Ninguna de las piezas que declara este caso está en el modelo cargado». </w:t>
+      </w:r>
+      <w:r>
+        <w:rPr>
+          <w:b/>
+          <w:bCs/>
+        </w:rPr>
+        <w:t xml:space="preserve">Rehace las piezas solo</w:t>
+      </w:r>
+      <w:r>
+        <w:t xml:space="preserve">: quita las que el modelo no tiene, conserva las que coinciden con el papel que usted les dio, añade las que faltan desde lo que el propio modelo dice de sí mismo y pasa lo que cada paso mostraba al modelo nuevo por su papel (la piel sigue siendo la piel). Lo cuenta en un aviso con </w:t>
+      </w:r>
+      <w:r>
+        <w:rPr>
+          <w:b/>
+          <w:bCs/>
+        </w:rPr>
+        <w:t xml:space="preserve">Deshacer</w:t>
+      </w:r>
+      <w:r>
+        <w:t xml:space="preserve">. Lo que suele faltar es marcar cuál es el fragmento móvil.</w:t>
+      </w:r>
+    </w:p>
+    <w:p>
+      <w:pPr>
+        <w:pStyle w:val="Heading2"/>
+      </w:pPr>
+      <w:r>
+        <w:t xml:space="preserve">Coser</w:t>
+      </w:r>
+    </w:p>
+    <w:p>
+      <w:pPr>
+        <w:pStyle w:val="ListParagraph"/>
+        <w:numPr>
+          <w:ilvl w:val="0"/>
+          <w:numId w:val="22"/>
+        </w:numPr>
+        <w:spacing w:after="90" w:line="280"/>
+      </w:pPr>
+      <w:r>
+        <w:t xml:space="preserve">Abra </w:t>
+      </w:r>
+      <w:r>
+        <w:rPr>
+          <w:b/>
+          <w:bCs/>
+        </w:rPr>
+        <w:t xml:space="preserve">Suturas y cierre</w:t>
+      </w:r>
+      <w:r>
+        <w:t xml:space="preserve"> y coja un hilo (Nylon 3-0, Vicryl, Monocryl). El modo pasa a </w:t>
+      </w:r>
+      <w:r>
+        <w:rPr>
+          <w:b/>
+          <w:bCs/>
+        </w:rPr>
+        <w:t xml:space="preserve">Coser</w:t>
+      </w:r>
+      <w:r>
+        <w:t xml:space="preserve">.</w:t>
+      </w:r>
+    </w:p>
+    <w:p>
+      <w:pPr>
+        <w:pStyle w:val="ListParagraph"/>
+        <w:numPr>
+          <w:ilvl w:val="0"/>
+          <w:numId w:val="22"/>
+        </w:numPr>
+        <w:spacing w:after="90" w:line="280"/>
+      </w:pPr>
+      <w:r>
+        <w:rPr>
+          <w:b/>
+          <w:bCs/>
+        </w:rPr>
+        <w:t xml:space="preserve">Pique con un clic</w:t>
+      </w:r>
+      <w:r>
+        <w:t xml:space="preserve"> sobre la piel: cada clic suma una puntada y el hilo queda dibujado entre una y otra, pegado al tejido. Con el arrastre se gira el modelo.</w:t>
+      </w:r>
+    </w:p>
+    <w:p>
+      <w:pPr>
+        <w:pStyle w:val="ListParagraph"/>
+        <w:numPr>
+          <w:ilvl w:val="0"/>
+          <w:numId w:val="22"/>
+        </w:numPr>
+        <w:spacing w:after="90" w:line="280"/>
+      </w:pPr>
+      <w:r>
+        <w:t xml:space="preserve">Una puntada que cae </w:t>
+      </w:r>
+      <w:r>
+        <w:rPr>
+          <w:b/>
+          <w:bCs/>
+        </w:rPr>
+        <w:t xml:space="preserve">al otro lado de la herida</w:t>
+      </w:r>
+      <w:r>
+        <w:t xml:space="preserve"> la cruza y la va cerrando: cada cruce cubre unos diez milímetros.</w:t>
+      </w:r>
+    </w:p>
+    <w:p>
+      <w:pPr>
+        <w:pStyle w:val="ListParagraph"/>
+        <w:numPr>
+          <w:ilvl w:val="0"/>
+          <w:numId w:val="22"/>
+        </w:numPr>
+        <w:spacing w:after="90" w:line="280"/>
+      </w:pPr>
+      <w:r>
+        <w:t xml:space="preserve">El panel cuenta las puntadas, el hilo gastado, los cruces y la separación media. Lo habitual en piel es </w:t>
+      </w:r>
+      <w:r>
+        <w:rPr>
+          <w:b/>
+          <w:bCs/>
+        </w:rPr>
+        <w:t xml:space="preserve">de 5 a 10 mm</w:t>
+      </w:r>
+      <w:r>
+        <w:t xml:space="preserve"> entre puntadas; la consola avisa si va muy junta o muy abierta.</w:t>
+      </w:r>
+    </w:p>
+    <w:p>
+      <w:pPr>
+        <w:pStyle w:val="ListParagraph"/>
+        <w:numPr>
+          <w:ilvl w:val="0"/>
+          <w:numId w:val="22"/>
+        </w:numPr>
+        <w:spacing w:after="90" w:line="280"/>
+      </w:pPr>
+      <w:r>
+        <w:t xml:space="preserve">«Deshacer la última» quita una puntada, «Cortar el hilo» hace que la siguiente empiece otra línea, y «Quitar la sutura» devuelve la herida a como estaba.</w:t>
+      </w:r>
+    </w:p>
+    <w:p>
+      <w:pPr>
+        <w:keepNext/>
+        <w:spacing w:after="60" w:before="120"/>
+        <w:jc w:val="center"/>
+      </w:pPr>
+      <w:r>
+        <w:drawing>
+          <wp:inline distT="0" distB="0" distL="0" distR="0">
+            <wp:extent cx="4905375" cy="4086225"/>
+            <wp:effectExtent t="0" r="0" b="0" l="0"/>
+            <wp:docPr id="30" name="114-sutura-en-la-herida" descr="Una herida de 177 mm abierta con un separador autoestático y cinco puntadas de nylon sobre ella: el hilo cruza el hueco y queda tendido entre los bordes." title="Una herida de 177 mm abierta con un separador autoestático y cinco puntadas de nylon sobre ella: el hilo cruza el hueco y queda tendido entre los bordes."/>
+            <wp:cNvGraphicFramePr>
+              <a:graphicFrameLocks xmlns:a="http://schemas.openxmlformats.org/drawingml/2006/main" noChangeAspect="1"/>
+            </wp:cNvGraphicFramePr>
+            <a:graphic xmlns:a="http://schemas.openxmlformats.org/drawingml/2006/main">
+              <a:graphicData uri="http://schemas.openxmlformats.org/drawingml/2006/picture">
+                <pic:pic xmlns:pic="http://schemas.openxmlformats.org/drawingml/2006/picture">
+                  <pic:nvPicPr>
+                    <pic:cNvPr id="0" name="" descr=""/>
+                    <pic:cNvPicPr>
+                      <a:picLocks noChangeAspect="1" noChangeArrowheads="1"/>
+                    </pic:cNvPicPr>
+                  </pic:nvPicPr>
+                  <pic:blipFill>
+                    <a:blip r:embed="rId40" cstate="none"/>
+                    <a:srcRect/>
+                    <a:stretch>
+                      <a:fillRect/>
+                    </a:stretch>
+                  </pic:blipFill>
+                  <pic:spPr bwMode="auto">
+                    <a:xfrm>
+                      <a:off x="0" y="0"/>
+                      <a:ext cx="4905375" cy="4086225"/>
+                    </a:xfrm>
+                    <a:prstGeom prst="rect">
+                      <a:avLst/>
+                    </a:prstGeom>
+                  </pic:spPr>
+                </pic:pic>
+              </a:graphicData>
+            </a:graphic>
+          </wp:inline>
+        </w:drawing>
+      </w:r>
+    </w:p>
+    <w:p>
+      <w:pPr>
+        <w:spacing w:after="200"/>
+        <w:jc w:val="center"/>
+      </w:pPr>
+      <w:r>
+        <w:rPr>
+          <w:b/>
+          <w:bCs/>
+          <w:color w:val="5B6577"/>
+          <w:sz w:val="19"/>
+          <w:szCs w:val="19"/>
+        </w:rPr>
+        <w:t xml:space="preserve">Figura 30. </w:t>
+      </w:r>
+      <w:r>
+        <w:rPr>
+          <w:i/>
+          <w:iCs/>
+          <w:color w:val="5B6577"/>
+          <w:sz w:val="19"/>
+          <w:szCs w:val="19"/>
+        </w:rPr>
+        <w:t xml:space="preserve">Una herida de 177 mm abierta con un separador autoestático y cinco puntadas de nylon sobre ella: el hilo cruza el hueco y queda tendido entre los bordes.</w:t>
+      </w:r>
+    </w:p>
+    <w:p>
+      <w:pPr>
+        <w:pStyle w:val="Heading2"/>
+      </w:pPr>
+      <w:r>
+        <w:t xml:space="preserve">Fijar con placa y tornillos</w:t>
+      </w:r>
+    </w:p>
+    <w:p>
+      <w:pPr>
+        <w:pStyle w:val="ListParagraph"/>
+        <w:numPr>
+          <w:ilvl w:val="0"/>
+          <w:numId w:val="23"/>
+        </w:numPr>
+        <w:spacing w:after="90" w:line="280"/>
+      </w:pPr>
+      <w:r>
+        <w:t xml:space="preserve">Abra </w:t>
+      </w:r>
+      <w:r>
+        <w:rPr>
+          <w:b/>
+          <w:bCs/>
+        </w:rPr>
+        <w:t xml:space="preserve">Placas</w:t>
+      </w:r>
+      <w:r>
+        <w:t xml:space="preserve">, coja una (por ejemplo la LCP recta de 3,5 mm) y pase al modo </w:t>
+      </w:r>
+      <w:r>
+        <w:rPr>
+          <w:b/>
+          <w:bCs/>
+        </w:rPr>
+        <w:t xml:space="preserve">Fijar</w:t>
+      </w:r>
+      <w:r>
+        <w:t xml:space="preserve">. </w:t>
+      </w:r>
+      <w:r>
+        <w:rPr>
+          <w:b/>
+          <w:bCs/>
+        </w:rPr>
+        <w:t xml:space="preserve">Pique sobre el hueso</w:t>
+      </w:r>
+      <w:r>
+        <w:t xml:space="preserve">: la placa se apoya con su largo siguiendo el hueso y se ven sus agujeros.</w:t>
+      </w:r>
+    </w:p>
+    <w:p>
+      <w:pPr>
+        <w:pStyle w:val="ListParagraph"/>
+        <w:numPr>
+          <w:ilvl w:val="0"/>
+          <w:numId w:val="23"/>
+        </w:numPr>
+        <w:spacing w:after="90" w:line="280"/>
+      </w:pPr>
+      <w:r>
+        <w:t xml:space="preserve">Coja el </w:t>
+      </w:r>
+      <w:r>
+        <w:rPr>
+          <w:b/>
+          <w:bCs/>
+        </w:rPr>
+        <w:t xml:space="preserve">medidor de profundidad</w:t>
+      </w:r>
+      <w:r>
+        <w:t xml:space="preserve"> (en «Perforación y fijación») y apóyelo en un agujero: dice cuánto hueso hay debajo y </w:t>
+      </w:r>
+      <w:r>
+        <w:rPr>
+          <w:b/>
+          <w:bCs/>
+        </w:rPr>
+        <w:t xml:space="preserve">qué tornillo pedir</w:t>
+      </w:r>
+      <w:r>
+        <w:t xml:space="preserve"> (lo medido más dos milímetros).</w:t>
+      </w:r>
+    </w:p>
+    <w:p>
+      <w:pPr>
+        <w:pStyle w:val="ListParagraph"/>
+        <w:numPr>
+          <w:ilvl w:val="0"/>
+          <w:numId w:val="23"/>
+        </w:numPr>
+        <w:spacing w:after="90" w:line="280"/>
+      </w:pPr>
+      <w:r>
+        <w:t xml:space="preserve">Abra </w:t>
+      </w:r>
+      <w:r>
+        <w:rPr>
+          <w:b/>
+          <w:bCs/>
+        </w:rPr>
+        <w:t xml:space="preserve">Tornillos</w:t>
+      </w:r>
+      <w:r>
+        <w:t xml:space="preserve">, coja uno de placa y ajuste su </w:t>
+      </w:r>
+      <w:r>
+        <w:rPr>
+          <w:b/>
+          <w:bCs/>
+        </w:rPr>
+        <w:t xml:space="preserve">largo</w:t>
+      </w:r>
+      <w:r>
+        <w:t xml:space="preserve"> con el deslizador. Pique en un agujero: el tornillo entra perpendicular a la placa y la consola dice si es </w:t>
+      </w:r>
+      <w:r>
+        <w:rPr>
+          <w:b/>
+          <w:bCs/>
+        </w:rPr>
+        <w:t xml:space="preserve">bicortical</w:t>
+      </w:r>
+      <w:r>
+        <w:t xml:space="preserve"> y si la punta asoma de más (hasta cuatro milímetros se tolera).</w:t>
+      </w:r>
+    </w:p>
+    <w:p>
+      <w:pPr>
+        <w:pStyle w:val="ListParagraph"/>
+        <w:numPr>
+          <w:ilvl w:val="0"/>
+          <w:numId w:val="23"/>
+        </w:numPr>
+        <w:spacing w:after="90" w:line="280"/>
+      </w:pPr>
+      <w:r>
+        <w:t xml:space="preserve">«Quitar los tornillos» y «Quitar la placa» limpian lo puesto.</w:t>
+      </w:r>
+    </w:p>
+    <w:p>
+      <w:pPr>
+        <w:keepNext/>
+        <w:spacing w:after="60" w:before="120"/>
+        <w:jc w:val="center"/>
+      </w:pPr>
+      <w:r>
+        <w:drawing>
+          <wp:inline distT="0" distB="0" distL="0" distR="0">
+            <wp:extent cx="4905375" cy="4086225"/>
+            <wp:effectExtent t="0" r="0" b="0" l="0"/>
+            <wp:docPr id="31" name="115-placa-y-tornillos" descr="Una placa LCP de 3,5 mm apoyada en la tibia, con dos tornillos puestos en sus agujeros, vista girada para ver cómo la placa sigue el hueso." title="Una placa LCP de 3,5 mm apoyada en la tibia, con dos tornillos puestos en sus agujeros, vista girada para ver cómo la placa sigue el hueso."/>
+            <wp:cNvGraphicFramePr>
+              <a:graphicFrameLocks xmlns:a="http://schemas.openxmlformats.org/drawingml/2006/main" noChangeAspect="1"/>
+            </wp:cNvGraphicFramePr>
+            <a:graphic xmlns:a="http://schemas.openxmlformats.org/drawingml/2006/main">
+              <a:graphicData uri="http://schemas.openxmlformats.org/drawingml/2006/picture">
+                <pic:pic xmlns:pic="http://schemas.openxmlformats.org/drawingml/2006/picture">
+                  <pic:nvPicPr>
+                    <pic:cNvPr id="0" name="" descr=""/>
+                    <pic:cNvPicPr>
+                      <a:picLocks noChangeAspect="1" noChangeArrowheads="1"/>
+                    </pic:cNvPicPr>
+                  </pic:nvPicPr>
+                  <pic:blipFill>
+                    <a:blip r:embed="rId41" cstate="none"/>
+                    <a:srcRect/>
+                    <a:stretch>
+                      <a:fillRect/>
+                    </a:stretch>
+                  </pic:blipFill>
+                  <pic:spPr bwMode="auto">
+                    <a:xfrm>
+                      <a:off x="0" y="0"/>
+                      <a:ext cx="4905375" cy="4086225"/>
+                    </a:xfrm>
+                    <a:prstGeom prst="rect">
+                      <a:avLst/>
+                    </a:prstGeom>
+                  </pic:spPr>
+                </pic:pic>
+              </a:graphicData>
+            </a:graphic>
+          </wp:inline>
+        </w:drawing>
+      </w:r>
+    </w:p>
+    <w:p>
+      <w:pPr>
+        <w:spacing w:after="200"/>
+        <w:jc w:val="center"/>
+      </w:pPr>
+      <w:r>
+        <w:rPr>
+          <w:b/>
+          <w:bCs/>
+          <w:color w:val="5B6577"/>
+          <w:sz w:val="19"/>
+          <w:szCs w:val="19"/>
+        </w:rPr>
+        <w:t xml:space="preserve">Figura 31. </w:t>
+      </w:r>
+      <w:r>
+        <w:rPr>
+          <w:i/>
+          <w:iCs/>
+          <w:color w:val="5B6577"/>
+          <w:sz w:val="19"/>
+          <w:szCs w:val="19"/>
+        </w:rPr>
+        <w:t xml:space="preserve">Una placa LCP de 3,5 mm apoyada en la tibia, con dos tornillos puestos en sus agujeros, vista girada para ver cómo la placa sigue el hueso.</w:t>
+      </w:r>
+    </w:p>
+    <w:tbl>
+      <w:tblPr>
+        <w:tblW w:type="dxa" w:w="9360"/>
+        <w:tblBorders>
+          <w:top w:val="single" w:color="auto" w:sz="4"/>
+          <w:left w:val="single" w:color="auto" w:sz="4"/>
+          <w:bottom w:val="single" w:color="auto" w:sz="4"/>
+          <w:right w:val="single" w:color="auto" w:sz="4"/>
+          <w:insideH w:val="single" w:color="auto" w:sz="4"/>
+          <w:insideV w:val="single" w:color="auto" w:sz="4"/>
+        </w:tblBorders>
+      </w:tblPr>
+      <w:tblGrid>
+        <w:gridCol w:w="9360"/>
+      </w:tblGrid>
+      <w:tr>
+        <w:trPr>
+          <w:cantSplit/>
+        </w:trPr>
+        <w:tc>
+          <w:tcPr>
+            <w:tcW w:type="dxa" w:w="9360"/>
+            <w:tcBorders>
+              <w:top w:val="single" w:color="F3F4F6" w:sz="1"/>
+              <w:left w:val="single" w:color="5B6577" w:sz="24"/>
+              <w:bottom w:val="single" w:color="F3F4F6" w:sz="1"/>
+              <w:right w:val="single" w:color="F3F4F6" w:sz="1"/>
+            </w:tcBorders>
+            <w:shd w:fill="F3F4F6" w:color="auto" w:val="clear"/>
+            <w:tcMar>
+              <w:top w:type="dxa" w:w="100"/>
+              <w:left w:type="dxa" w:w="180"/>
+              <w:bottom w:type="dxa" w:w="80"/>
+              <w:right w:type="dxa" w:w="180"/>
+            </w:tcMar>
+          </w:tcPr>
+          <w:p>
+            <w:pPr>
+              <w:spacing w:after="60"/>
+            </w:pPr>
+            <w:r>
+              <w:rPr>
+                <w:b/>
+                <w:bCs/>
+                <w:color w:val="5B6577"/>
+              </w:rPr>
+              <w:t xml:space="preserve">Qué se coloca</w:t>
+            </w:r>
+          </w:p>
+          <w:p>
+            <w:pPr>
+              <w:spacing w:after="60" w:line="276"/>
+            </w:pPr>
+            <w:r>
+              <w:t xml:space="preserve">Solo las placas y los tornillos de placa se colocan sobre el hueso. Los clavos y el injerto siguen viéndose en la escena y nada más. Los modelos de las placas traen la posición de sus agujeros dentro del archivo; una placa cargada antes de esto no la trae y la consola lo dice.</w:t>
+            </w:r>
+          </w:p>
+        </w:tc>
+      </w:tr>
+    </w:tbl>
+    <w:p>
+      <w:pPr>
+        <w:pStyle w:val="Heading2"/>
+      </w:pPr>
+      <w:r>
+        <w:t xml:space="preserve">La broca y la fijación puntúan</w:t>
+      </w:r>
+    </w:p>
+    <w:p>
+      <w:pPr>
+        <w:spacing w:after="120" w:line="288"/>
+      </w:pPr>
+      <w:r>
+        <w:t xml:space="preserve">En el editor, «Qué se evalúa en este paso» tiene dos opciones nuevas:</w:t>
+      </w:r>
+    </w:p>
+    <w:p>
+      <w:pPr>
+        <w:pStyle w:val="ListParagraph"/>
+        <w:numPr>
+          <w:ilvl w:val="0"/>
+          <w:numId w:val="3"/>
+        </w:numPr>
+        <w:spacing w:after="70" w:line="276"/>
+      </w:pPr>
+      <w:r>
+        <w:rPr>
+          <w:b/>
+          <w:bCs/>
+        </w:rPr>
+        <w:t xml:space="preserve">Perforar con el calibre y el ángulo correctos</w:t>
+      </w:r>
+      <w:r>
+        <w:t xml:space="preserve">: el calibre de la broca (opcional), el rango de ángulo con el eje del hueso (90° es perpendicular) y si tiene que ser bicortical. Pasarse más de 3 mm de la cortical opuesta es una </w:t>
+      </w:r>
+      <w:r>
+        <w:rPr>
+          <w:b/>
+          <w:bCs/>
+        </w:rPr>
+        <w:t xml:space="preserve">complicación</w:t>
+      </w:r>
+      <w:r>
+        <w:t xml:space="preserve">: el paso entero se pierde.</w:t>
+      </w:r>
+    </w:p>
+    <w:p>
+      <w:pPr>
+        <w:pStyle w:val="ListParagraph"/>
+        <w:numPr>
+          <w:ilvl w:val="0"/>
+          <w:numId w:val="3"/>
+        </w:numPr>
+        <w:spacing w:after="70" w:line="276"/>
+      </w:pPr>
+      <w:r>
+        <w:rPr>
+          <w:b/>
+          <w:bCs/>
+        </w:rPr>
+        <w:t xml:space="preserve">Fijar con placa y tornillos</w:t>
+      </w:r>
+      <w:r>
+        <w:t xml:space="preserve">: cuántos tornillos hacen falta y si tienen que cruzar las dos corticales. Un tornillo largo es una complicación.</w:t>
+      </w:r>
+    </w:p>
+    <w:p>
+      <w:pPr>
+        <w:pStyle w:val="Heading2"/>
+      </w:pPr>
+      <w:r>
+        <w:t xml:space="preserve">La fractura en martillo</w:t>
+      </w:r>
+    </w:p>
+    <w:p>
+      <w:pPr>
+        <w:spacing w:after="120" w:line="288"/>
+      </w:pPr>
+      <w:r>
+        <w:t xml:space="preserve">En la pestaña </w:t>
+      </w:r>
+      <w:r>
+        <w:rPr>
+          <w:b/>
+          <w:bCs/>
+        </w:rPr>
+        <w:t xml:space="preserve">Fractura</w:t>
+      </w:r>
+      <w:r>
+        <w:t xml:space="preserve"> del taller anatómico, con un hueso elegido, el tipo </w:t>
+      </w:r>
+      <w:r>
+        <w:rPr>
+          <w:b/>
+          <w:bCs/>
+        </w:rPr>
+        <w:t xml:space="preserve">C (multifragmentaria)</w:t>
+      </w:r>
+      <w:r>
+        <w:t xml:space="preserve"> ofrece ahora la </w:t>
+      </w:r>
+      <w:r>
+        <w:rPr>
+          <w:b/>
+          <w:bCs/>
+        </w:rPr>
+        <w:t xml:space="preserve">conminuta focal («martillo»)</w:t>
+      </w:r>
+      <w:r>
+        <w:t xml:space="preserve">: un golpe en un solo punto que deja la diáfisis en </w:t>
+      </w:r>
+      <w:r>
+        <w:rPr>
+          <w:b/>
+          <w:bCs/>
+        </w:rPr>
+        <w:t xml:space="preserve">seis trozos</w:t>
+      </w:r>
+      <w:r>
+        <w:t xml:space="preserve"> juntos, la multifragmentaria que más se ve. Se mueve el centro, cuánto ocupa y de qué lado saltan las esquirlas; «otra variante» cambia su orientación. Su código es solo el tipo (</w:t>
+      </w:r>
+      <w:r>
+        <w:rPr>
+          <w:rFonts w:ascii="Consolas" w:cs="Consolas" w:eastAsia="Consolas" w:hAnsi="Consolas"/>
+          <w:color w:val="0F2A55"/>
+          <w:sz w:val="20"/>
+          <w:szCs w:val="20"/>
+          <w:shd w:fill="E6ECF7" w:val="clear"/>
+        </w:rPr>
+        <w:t xml:space="preserve">42-C</w:t>
+      </w:r>
+      <w:r>
+        <w:t xml:space="preserve">), porque el compendio de 2018 no numera los grupos de la diáfisis.</w:t>
+      </w:r>
+    </w:p>
+    <w:tbl>
+      <w:tblPr>
+        <w:tblW w:type="dxa" w:w="9360"/>
+        <w:tblBorders>
+          <w:top w:val="single" w:color="auto" w:sz="4"/>
+          <w:left w:val="single" w:color="auto" w:sz="4"/>
+          <w:bottom w:val="single" w:color="auto" w:sz="4"/>
+          <w:right w:val="single" w:color="auto" w:sz="4"/>
+          <w:insideH w:val="single" w:color="auto" w:sz="4"/>
+          <w:insideV w:val="single" w:color="auto" w:sz="4"/>
+        </w:tblBorders>
+      </w:tblPr>
+      <w:tblGrid>
+        <w:gridCol w:w="9360"/>
+      </w:tblGrid>
+      <w:tr>
+        <w:trPr>
+          <w:cantSplit/>
+        </w:trPr>
+        <w:tc>
+          <w:tcPr>
+            <w:tcW w:type="dxa" w:w="9360"/>
+            <w:tcBorders>
+              <w:top w:val="single" w:color="FEF3E2" w:sz="1"/>
+              <w:left w:val="single" w:color="B45309" w:sz="24"/>
+              <w:bottom w:val="single" w:color="FEF3E2" w:sz="1"/>
+              <w:right w:val="single" w:color="FEF3E2" w:sz="1"/>
+            </w:tcBorders>
+            <w:shd w:fill="FEF3E2" w:color="auto" w:val="clear"/>
+            <w:tcMar>
+              <w:top w:type="dxa" w:w="100"/>
+              <w:left w:type="dxa" w:w="180"/>
+              <w:bottom w:type="dxa" w:w="80"/>
+              <w:right w:type="dxa" w:w="180"/>
+            </w:tcMar>
+          </w:tcPr>
+          <w:p>
+            <w:pPr>
+              <w:spacing w:after="60"/>
+            </w:pPr>
+            <w:r>
+              <w:rPr>
+                <w:b/>
+                <w:bCs/>
+                <w:color w:val="B45309"/>
+              </w:rPr>
+              <w:t xml:space="preserve">Dónde no sale</w:t>
+            </w:r>
+          </w:p>
+          <w:p>
+            <w:pPr>
+              <w:spacing w:after="60" w:line="276"/>
+            </w:pPr>
+            <w:r>
+              <w:t xml:space="preserve">No sale en la clavícula ni en unas falanges de 15 a 30 mm, donde no hay hueso para cinco cortes. La pestaña lo avisa con una nota bajo el hueso, y el motivo, pieza por pieza, está en las pruebas.</w:t>
+            </w:r>
+          </w:p>
+        </w:tc>
+      </w:tr>
+    </w:tbl>
+    <w:p>
+      <w:pPr>
+        <w:pStyle w:val="Heading2"/>
+      </w:pPr>
+      <w:r>
+        <w:t xml:space="preserve">Los códigos de la mano y del pie, contrastados</w:t>
+      </w:r>
+    </w:p>
+    <w:p>
+      <w:pPr>
+        <w:spacing w:after="120" w:line="288"/>
+      </w:pPr>
+      <w:r>
+        <w:t xml:space="preserve">Se contrastaron con el compendio AO/OTA 2018. Los de la mano son </w:t>
+      </w:r>
+      <w:r>
+        <w:rPr>
+          <w:b/>
+          <w:bCs/>
+        </w:rPr>
+        <w:t xml:space="preserve">77</w:t>
+      </w:r>
+      <w:r>
+        <w:t xml:space="preserve"> (metacarpianos) y </w:t>
+      </w:r>
+      <w:r>
+        <w:rPr>
+          <w:b/>
+          <w:bCs/>
+        </w:rPr>
+        <w:t xml:space="preserve">78</w:t>
+      </w:r>
+      <w:r>
+        <w:t xml:space="preserve"> (falanges); los del pie, </w:t>
+      </w:r>
+      <w:r>
+        <w:rPr>
+          <w:b/>
+          <w:bCs/>
+        </w:rPr>
+        <w:t xml:space="preserve">87</w:t>
+      </w:r>
+      <w:r>
+        <w:t xml:space="preserve"> (metatarsianos) y </w:t>
+      </w:r>
+      <w:r>
+        <w:rPr>
+          <w:b/>
+          <w:bCs/>
+        </w:rPr>
+        <w:t xml:space="preserve">88</w:t>
+      </w:r>
+      <w:r>
+        <w:t xml:space="preserve"> (falanges), con el rayo o el dedo después del hueso: </w:t>
+      </w:r>
+      <w:r>
+        <w:rPr>
+          <w:rFonts w:ascii="Consolas" w:cs="Consolas" w:eastAsia="Consolas" w:hAnsi="Consolas"/>
+          <w:color w:val="0F2A55"/>
+          <w:sz w:val="20"/>
+          <w:szCs w:val="20"/>
+          <w:shd w:fill="E6ECF7" w:val="clear"/>
+        </w:rPr>
+        <w:t xml:space="preserve">77.3.2-A3</w:t>
+      </w:r>
+      <w:r>
+        <w:t xml:space="preserve"> es el tercer metacarpiano, en su diáfisis. El radio, el cúbito y el peroné se escriben </w:t>
+      </w:r>
+      <w:r>
+        <w:rPr>
+          <w:rFonts w:ascii="Consolas" w:cs="Consolas" w:eastAsia="Consolas" w:hAnsi="Consolas"/>
+          <w:color w:val="0F2A55"/>
+          <w:sz w:val="20"/>
+          <w:szCs w:val="20"/>
+          <w:shd w:fill="E6ECF7" w:val="clear"/>
+        </w:rPr>
+        <w:t xml:space="preserve">2R2</w:t>
+      </w:r>
+      <w:r>
+        <w:t xml:space="preserve">, </w:t>
+      </w:r>
+      <w:r>
+        <w:rPr>
+          <w:rFonts w:ascii="Consolas" w:cs="Consolas" w:eastAsia="Consolas" w:hAnsi="Consolas"/>
+          <w:color w:val="0F2A55"/>
+          <w:sz w:val="20"/>
+          <w:szCs w:val="20"/>
+          <w:shd w:fill="E6ECF7" w:val="clear"/>
+        </w:rPr>
+        <w:t xml:space="preserve">2U2</w:t>
+      </w:r>
+      <w:r>
+        <w:t xml:space="preserve"> y </w:t>
+      </w:r>
+      <w:r>
+        <w:rPr>
+          <w:rFonts w:ascii="Consolas" w:cs="Consolas" w:eastAsia="Consolas" w:hAnsi="Consolas"/>
+          <w:color w:val="0F2A55"/>
+          <w:sz w:val="20"/>
+          <w:szCs w:val="20"/>
+          <w:shd w:fill="E6ECF7" w:val="clear"/>
+        </w:rPr>
+        <w:t xml:space="preserve">4F2</w:t>
+      </w:r>
+      <w:r>
+        <w:t xml:space="preserve">. Solo el del metatarsiano sigue marcado como provisional. Queda por hablar con Cristóbal que en 2018 la diáfisis solo lleva el tipo (</w:t>
+      </w:r>
+      <w:r>
+        <w:rPr>
+          <w:rFonts w:ascii="Consolas" w:cs="Consolas" w:eastAsia="Consolas" w:hAnsi="Consolas"/>
+          <w:color w:val="0F2A55"/>
+          <w:sz w:val="20"/>
+          <w:szCs w:val="20"/>
+          <w:shd w:fill="E6ECF7" w:val="clear"/>
+        </w:rPr>
+        <w:t xml:space="preserve">42B</w:t>
+      </w:r>
+      <w:r>
+        <w:t xml:space="preserve">, </w:t>
+      </w:r>
+      <w:r>
+        <w:rPr>
+          <w:rFonts w:ascii="Consolas" w:cs="Consolas" w:eastAsia="Consolas" w:hAnsi="Consolas"/>
+          <w:color w:val="0F2A55"/>
+          <w:sz w:val="20"/>
+          <w:szCs w:val="20"/>
+          <w:shd w:fill="E6ECF7" w:val="clear"/>
+        </w:rPr>
+        <w:t xml:space="preserve">42C</w:t>
+      </w:r>
+      <w:r>
+        <w:t xml:space="preserve">) y los grupos B2, B3, C2 y C3 son de la edición anterior.</w:t>
+      </w:r>
+    </w:p>
+    <w:p>
+      <w:pPr>
+        <w:pStyle w:val="Heading2"/>
+      </w:pPr>
+      <w:r>
+        <w:t xml:space="preserve">Buscar en Técnica AO por clasificación</w:t>
+      </w:r>
+    </w:p>
+    <w:p>
+      <w:pPr>
+        <w:spacing w:after="120" w:line="288"/>
+      </w:pPr>
+      <w:r>
+        <w:t xml:space="preserve">La portada de </w:t>
+      </w:r>
+      <w:r>
+        <w:rPr>
+          <w:b/>
+          <w:bCs/>
+        </w:rPr>
+        <w:t xml:space="preserve">Técnica AO</w:t>
+      </w:r>
+      <w:r>
+        <w:t xml:space="preserve"> tiene arriba un buscador como el de AO Surgery Reference: se elige el </w:t>
+      </w:r>
+      <w:r>
+        <w:rPr>
+          <w:b/>
+          <w:bCs/>
+        </w:rPr>
+        <w:t xml:space="preserve">hueso</w:t>
+      </w:r>
+      <w:r>
+        <w:t xml:space="preserve">, el </w:t>
+      </w:r>
+      <w:r>
+        <w:rPr>
+          <w:b/>
+          <w:bCs/>
+        </w:rPr>
+        <w:t xml:space="preserve">segmento</w:t>
+      </w:r>
+      <w:r>
+        <w:t xml:space="preserve">, el </w:t>
+      </w:r>
+      <w:r>
+        <w:rPr>
+          <w:b/>
+          <w:bCs/>
+        </w:rPr>
+        <w:t xml:space="preserve">tipo</w:t>
+      </w:r>
+      <w:r>
+        <w:t xml:space="preserve">, el </w:t>
+      </w:r>
+      <w:r>
+        <w:rPr>
+          <w:b/>
+          <w:bCs/>
+        </w:rPr>
+        <w:t xml:space="preserve">patrón</w:t>
+      </w:r>
+      <w:r>
+        <w:t xml:space="preserve"> y las </w:t>
+      </w:r>
+      <w:r>
+        <w:rPr>
+          <w:b/>
+          <w:bCs/>
+        </w:rPr>
+        <w:t xml:space="preserve">alternativas de manejo</w:t>
+      </w:r>
+      <w:r>
+        <w:t xml:space="preserve"> (placa, clavo, tornillos…). Cada opción dice </w:t>
+      </w:r>
+      <w:r>
+        <w:rPr>
+          <w:b/>
+          <w:bCs/>
+        </w:rPr>
+        <w:t xml:space="preserve">cuántas fichas</w:t>
+      </w:r>
+      <w:r>
+        <w:t xml:space="preserve"> hay detrás. Para que una ficha aparezca hay que escribir su código AO y elegir su «Manejo que enseña»; el listado de siempre sigue debajo como «Todas las técnicas».</w:t>
+      </w:r>
+    </w:p>
+    <w:p>
+      <w:pPr>
+        <w:keepNext/>
+        <w:spacing w:after="60" w:before="120"/>
+        <w:jc w:val="center"/>
+      </w:pPr>
+      <w:r>
+        <w:drawing>
+          <wp:inline distT="0" distB="0" distL="0" distR="0">
+            <wp:extent cx="4905375" cy="3857625"/>
+            <wp:effectExtent t="0" r="0" b="0" l="0"/>
+            <wp:docPr id="32" name="116-buscador-por-clasificacion" descr="El buscador con «Tibia» y «Distal» elegidos: los tres tipos con su número de fichas, las alternativas de manejo y la ficha que coincide." title="El buscador con «Tibia» y «Distal» elegidos: los tres tipos con su número de fichas, las alternativas de manejo y la ficha que coincide."/>
+            <wp:cNvGraphicFramePr>
+              <a:graphicFrameLocks xmlns:a="http://schemas.openxmlformats.org/drawingml/2006/main" noChangeAspect="1"/>
+            </wp:cNvGraphicFramePr>
+            <a:graphic xmlns:a="http://schemas.openxmlformats.org/drawingml/2006/main">
+              <a:graphicData uri="http://schemas.openxmlformats.org/drawingml/2006/picture">
+                <pic:pic xmlns:pic="http://schemas.openxmlformats.org/drawingml/2006/picture">
+                  <pic:nvPicPr>
+                    <pic:cNvPr id="0" name="" descr=""/>
+                    <pic:cNvPicPr>
+                      <a:picLocks noChangeAspect="1" noChangeArrowheads="1"/>
+                    </pic:cNvPicPr>
+                  </pic:nvPicPr>
+                  <pic:blipFill>
+                    <a:blip r:embed="rId42" cstate="none"/>
+                    <a:srcRect/>
+                    <a:stretch>
+                      <a:fillRect/>
+                    </a:stretch>
+                  </pic:blipFill>
+                  <pic:spPr bwMode="auto">
+                    <a:xfrm>
+                      <a:off x="0" y="0"/>
+                      <a:ext cx="4905375" cy="3857625"/>
+                    </a:xfrm>
+                    <a:prstGeom prst="rect">
+                      <a:avLst/>
+                    </a:prstGeom>
+                  </pic:spPr>
+                </pic:pic>
+              </a:graphicData>
+            </a:graphic>
+          </wp:inline>
+        </w:drawing>
+      </w:r>
+    </w:p>
+    <w:p>
+      <w:pPr>
+        <w:spacing w:after="200"/>
+        <w:jc w:val="center"/>
+      </w:pPr>
+      <w:r>
+        <w:rPr>
+          <w:b/>
+          <w:bCs/>
+          <w:color w:val="5B6577"/>
+          <w:sz w:val="19"/>
+          <w:szCs w:val="19"/>
+        </w:rPr>
+        <w:t xml:space="preserve">Figura 32. </w:t>
+      </w:r>
+      <w:r>
+        <w:rPr>
+          <w:i/>
+          <w:iCs/>
+          <w:color w:val="5B6577"/>
+          <w:sz w:val="19"/>
+          <w:szCs w:val="19"/>
+        </w:rPr>
+        <w:t xml:space="preserve">El buscador con «Tibia» y «Distal» elegidos: los tres tipos con su número de fichas, las alternativas de manejo y la ficha que coincide.</w:t>
+      </w:r>
+    </w:p>
+    <w:tbl>
+      <w:tblPr>
+        <w:tblW w:type="dxa" w:w="9360"/>
+        <w:tblBorders>
+          <w:top w:val="single" w:color="auto" w:sz="4"/>
+          <w:left w:val="single" w:color="auto" w:sz="4"/>
+          <w:bottom w:val="single" w:color="auto" w:sz="4"/>
+          <w:right w:val="single" w:color="auto" w:sz="4"/>
+          <w:insideH w:val="single" w:color="auto" w:sz="4"/>
+          <w:insideV w:val="single" w:color="auto" w:sz="4"/>
+        </w:tblBorders>
+      </w:tblPr>
+      <w:tblGrid>
+        <w:gridCol w:w="9360"/>
+      </w:tblGrid>
+      <w:tr>
+        <w:trPr>
+          <w:cantSplit/>
+        </w:trPr>
+        <w:tc>
+          <w:tcPr>
+            <w:tcW w:type="dxa" w:w="9360"/>
+            <w:tcBorders>
+              <w:top w:val="single" w:color="F3F4F6" w:sz="1"/>
+              <w:left w:val="single" w:color="5B6577" w:sz="24"/>
+              <w:bottom w:val="single" w:color="F3F4F6" w:sz="1"/>
+              <w:right w:val="single" w:color="F3F4F6" w:sz="1"/>
+            </w:tcBorders>
+            <w:shd w:fill="F3F4F6" w:color="auto" w:val="clear"/>
+            <w:tcMar>
+              <w:top w:type="dxa" w:w="100"/>
+              <w:left w:type="dxa" w:w="180"/>
+              <w:bottom w:type="dxa" w:w="80"/>
+              <w:right w:type="dxa" w:w="180"/>
+            </w:tcMar>
+          </w:tcPr>
+          <w:p>
+            <w:pPr>
+              <w:spacing w:after="60"/>
+            </w:pPr>
+            <w:r>
+              <w:rPr>
+                <w:b/>
+                <w:bCs/>
+                <w:color w:val="5B6577"/>
+              </w:rPr>
+              <w:t xml:space="preserve">Lo que falta de esta etapa</w:t>
+            </w:r>
+          </w:p>
+          <w:p>
+            <w:pPr>
+              <w:spacing w:after="60" w:line="276"/>
+            </w:pPr>
+            <w:r>
+              <w:t xml:space="preserve">Quedan por hacer la normalización de las 711 fichas importadas, las escenas grabadas en el taller, el reproductor paso a paso, la exportación a vídeo y los casos guía completos.</w:t>
+            </w:r>
+          </w:p>
+        </w:tc>
+      </w:tr>
+    </w:tbl>
+    <w:p>
+      <w:pPr>
+        <w:pStyle w:val="Heading1"/>
+        <w:pageBreakBefore/>
+      </w:pPr>
+      <w:bookmarkStart w:name="anexo" w:id="20"/>
       <w:r>
         <w:t xml:space="preserve">Anexos</w:t>
       </w:r>
-      <w:bookmarkEnd w:id="19"/>
+      <w:bookmarkEnd w:id="20"/>
     </w:p>
     <w:p>
       <w:pPr>
@@ -27551,6 +28718,18 @@
     </w:lvlOverride>
   </w:num>
   <w:num w:numId="21">
+    <w:abstractNumId w:val="3"/>
+    <w:lvlOverride w:ilvl="0">
+      <w:startOverride w:val="1"/>
+    </w:lvlOverride>
+  </w:num>
+  <w:num w:numId="22">
+    <w:abstractNumId w:val="3"/>
+    <w:lvlOverride w:ilvl="0">
+      <w:startOverride w:val="1"/>
+    </w:lvlOverride>
+  </w:num>
+  <w:num w:numId="23">
     <w:abstractNumId w:val="3"/>
     <w:lvlOverride w:ilvl="0">
       <w:startOverride w:val="1"/>

</xml_diff>